<commit_message>
Refonte modulaire views, securisation des acces, carte dematerialisee, ordonnance certifiee et memoire final
</commit_message>
<xml_diff>
--- a/CAHIER_DES_CHARGES.docx
+++ b/CAHIER_DES_CHARGES.docx
@@ -2,10 +2,7 @@
 <file path=word/document.xml><?xml version="1.0" encoding="utf-8"?>
 <w:document xmlns:wpc="http://schemas.microsoft.com/office/word/2010/wordprocessingCanvas" xmlns:cx="http://schemas.microsoft.com/office/drawing/2014/chartex" xmlns:cx1="http://schemas.microsoft.com/office/drawing/2015/9/8/chartex" xmlns:cx2="http://schemas.microsoft.com/office/drawing/2015/10/21/chartex" xmlns:cx3="http://schemas.microsoft.com/office/drawing/2016/5/9/chartex" xmlns:cx4="http://schemas.microsoft.com/office/drawing/2016/5/10/chartex" xmlns:cx5="http://schemas.microsoft.com/office/drawing/2016/5/11/chartex" xmlns:cx6="http://schemas.microsoft.com/office/drawing/2016/5/12/chartex" xmlns:cx7="http://schemas.microsoft.com/office/drawing/2016/5/13/chartex" xmlns:cx8="http://schemas.microsoft.com/office/drawing/2016/5/14/chartex" xmlns:mc="http://schemas.openxmlformats.org/markup-compatibility/2006" xmlns:o="urn:schemas-microsoft-com:office:office" xmlns:r="http://schemas.openxmlformats.org/officeDocument/2006/relationships" xmlns:m="http://schemas.openxmlformats.org/officeDocument/2006/math" xmlns:v="urn:schemas-microsoft-com:vml" xmlns:wp14="http://schemas.microsoft.com/office/word/2010/wordprocessingDrawing" xmlns:wp="http://schemas.openxmlformats.org/drawingml/2006/wordprocessingDrawing" xmlns:w="http://schemas.openxmlformats.org/wordprocessingml/2006/main" xmlns:w14="http://schemas.microsoft.com/office/word/2010/wordml" xmlns:w10="urn:schemas-microsoft-com:office:word" xmlns:w15="http://schemas.microsoft.com/office/word/2012/wordml" xmlns:wpg="http://schemas.microsoft.com/office/word/2010/wordprocessingGroup" xmlns:wpi="http://schemas.microsoft.com/office/word/2010/wordprocessingInk" xmlns:wne="http://schemas.microsoft.com/office/word/2006/wordml" xmlns:wps="http://schemas.microsoft.com/office/word/2010/wordprocessingShape" xmlns:wpsCustomData="http://www.wps.cn/officeDocument/2013/wpsCustomData" mc:Ignorable="w14 w15 wp14">
   <w:body>
-    <w:p>
-      <w:bookmarkStart w:id="43" w:name="_GoBack"/>
-      <w:bookmarkEnd w:id="43"/>
-    </w:p>
+    <w:p/>
     <w:p/>
     <w:p/>
     <w:p/>
@@ -47,34 +44,109 @@
     <w:p>
       <w:pPr>
         <w:jc w:val="center"/>
+        <w:rPr>
+          <w:rFonts w:hint="default"/>
+          <w:color w:val="555F63"/>
+          <w:lang w:val="fr-FR"/>
+        </w:rPr>
       </w:pPr>
       <w:r>
         <w:rPr>
           <w:color w:val="555F63"/>
         </w:rPr>
-        <w:t>Présenté par : ..........................................</w:t>
+        <w:t>Présenté par :</w:t>
+      </w:r>
+      <w:r>
+        <w:rPr>
+          <w:rFonts w:hint="default"/>
+          <w:color w:val="555F63"/>
+          <w:lang w:val="fr-FR"/>
+        </w:rPr>
+        <w:t>Mamadou Lamarana Diallo</w:t>
+      </w:r>
+    </w:p>
+    <w:p>
+      <w:pPr>
+        <w:ind w:firstLine="4180" w:firstLineChars="1900"/>
+        <w:jc w:val="both"/>
+        <w:rPr>
+          <w:rFonts w:hint="default"/>
+          <w:color w:val="555F63"/>
+          <w:lang w:val="fr-FR"/>
+        </w:rPr>
+      </w:pPr>
+      <w:r>
+        <w:rPr>
+          <w:rFonts w:hint="default"/>
+          <w:color w:val="555F63"/>
+          <w:lang w:val="fr-FR"/>
+        </w:rPr>
+        <w:t>Saliou Ndoye</w:t>
+      </w:r>
+    </w:p>
+    <w:p>
+      <w:pPr>
+        <w:ind w:firstLine="4180" w:firstLineChars="1900"/>
+        <w:jc w:val="both"/>
+        <w:rPr>
+          <w:rFonts w:hint="default"/>
+          <w:color w:val="555F63"/>
+          <w:lang w:val="fr-FR"/>
+        </w:rPr>
+      </w:pPr>
+      <w:r>
+        <w:rPr>
+          <w:rFonts w:hint="default"/>
+          <w:color w:val="555F63"/>
+          <w:lang w:val="fr-FR"/>
+        </w:rPr>
+        <w:t>Mamadou Coulibay</w:t>
       </w:r>
     </w:p>
     <w:p>
       <w:pPr>
         <w:jc w:val="center"/>
+        <w:rPr>
+          <w:rFonts w:hint="default"/>
+          <w:lang w:val="en-US"/>
+        </w:rPr>
       </w:pPr>
       <w:r>
         <w:rPr>
           <w:color w:val="555F63"/>
         </w:rPr>
-        <w:t>Sous la direction de : ..........................................</w:t>
+        <w:t xml:space="preserve">Sous la direction de </w:t>
+      </w:r>
+      <w:r>
+        <w:rPr>
+          <w:rFonts w:hint="default"/>
+          <w:color w:val="555F63"/>
+          <w:lang w:val="en-US"/>
+        </w:rPr>
+        <w:t>: Mr Lo</w:t>
       </w:r>
     </w:p>
     <w:p>
       <w:pPr>
         <w:jc w:val="center"/>
+        <w:rPr>
+          <w:rFonts w:hint="default"/>
+          <w:lang w:val="en-US"/>
+        </w:rPr>
       </w:pPr>
       <w:r>
         <w:rPr>
           <w:color w:val="555F63"/>
         </w:rPr>
-        <w:t>Année académique : ..........................</w:t>
+        <w:t xml:space="preserve">Année académique : </w:t>
+      </w:r>
+      <w:r>
+        <w:rPr>
+          <w:rFonts w:hint="default"/>
+          <w:color w:val="555F63"/>
+          <w:lang w:val="en-US"/>
+        </w:rPr>
+        <w:t>2025/2026</w:t>
       </w:r>
     </w:p>
     <w:p>
@@ -12107,6 +12179,12 @@
             <w:insideH w:val="single" w:color="4F81BD" w:themeColor="accent1" w:sz="8" w:space="0"/>
             <w:insideV w:val="single" w:color="4F81BD" w:themeColor="accent1" w:sz="8" w:space="0"/>
           </w:tblBorders>
+          <w:tblCellMar>
+            <w:top w:w="0" w:type="dxa"/>
+            <w:left w:w="108" w:type="dxa"/>
+            <w:bottom w:w="0" w:type="dxa"/>
+            <w:right w:w="108" w:type="dxa"/>
+          </w:tblCellMar>
         </w:tblPrEx>
         <w:trPr>
           <w:jc w:val="center"/>
@@ -12279,12 +12357,6 @@
             <w:insideH w:val="single" w:color="4F81BD" w:themeColor="accent1" w:sz="8" w:space="0"/>
             <w:insideV w:val="single" w:color="4F81BD" w:themeColor="accent1" w:sz="8" w:space="0"/>
           </w:tblBorders>
-          <w:tblCellMar>
-            <w:top w:w="0" w:type="dxa"/>
-            <w:left w:w="108" w:type="dxa"/>
-            <w:bottom w:w="0" w:type="dxa"/>
-            <w:right w:w="108" w:type="dxa"/>
-          </w:tblCellMar>
         </w:tblPrEx>
         <w:trPr>
           <w:jc w:val="center"/>
@@ -13548,8 +13620,13 @@
         <w:pStyle w:val="35"/>
       </w:pPr>
       <w:r>
-        <w:t>GNU Health — https://www.gnuhealth.org/</w:t>
-      </w:r>
+        <w:t xml:space="preserve">GNU Health — </w:t>
+      </w:r>
+      <w:bookmarkStart w:id="43" w:name="_GoBack"/>
+      <w:r>
+        <w:t>https://www.gnuhealth.org/</w:t>
+      </w:r>
+      <w:bookmarkEnd w:id="43"/>
     </w:p>
     <w:p>
       <w:pPr>
@@ -13873,9 +13950,9 @@
     <w:lsdException w:uiPriority="99" w:name="table of authorities"/>
     <w:lsdException w:qFormat="1" w:uiPriority="99" w:semiHidden="0" w:name="macro"/>
     <w:lsdException w:uiPriority="99" w:name="toa heading"/>
-    <w:lsdException w:uiPriority="99" w:semiHidden="0" w:name="List"/>
+    <w:lsdException w:qFormat="1" w:uiPriority="99" w:semiHidden="0" w:name="List"/>
     <w:lsdException w:qFormat="1" w:uiPriority="99" w:semiHidden="0" w:name="List Bullet"/>
-    <w:lsdException w:uiPriority="99" w:semiHidden="0" w:name="List Number"/>
+    <w:lsdException w:qFormat="1" w:uiPriority="99" w:semiHidden="0" w:name="List Number"/>
     <w:lsdException w:qFormat="1" w:uiPriority="99" w:semiHidden="0" w:name="List 2"/>
     <w:lsdException w:qFormat="1" w:uiPriority="99" w:semiHidden="0" w:name="List 3"/>
     <w:lsdException w:uiPriority="99" w:name="List 4"/>
@@ -13891,7 +13968,7 @@
     <w:lsdException w:qFormat="1" w:unhideWhenUsed="0" w:uiPriority="10" w:semiHidden="0" w:name="Title"/>
     <w:lsdException w:uiPriority="99" w:name="Closing"/>
     <w:lsdException w:uiPriority="99" w:name="Signature"/>
-    <w:lsdException w:uiPriority="1" w:name="Default Paragraph Font"/>
+    <w:lsdException w:qFormat="1" w:uiPriority="1" w:name="Default Paragraph Font"/>
     <w:lsdException w:qFormat="1" w:uiPriority="99" w:semiHidden="0" w:name="Body Text"/>
     <w:lsdException w:uiPriority="99" w:name="Body Text Indent"/>
     <w:lsdException w:qFormat="1" w:uiPriority="99" w:semiHidden="0" w:name="List Continue"/>
@@ -14282,6 +14359,7 @@
     <w:name w:val="Default Paragraph Font"/>
     <w:semiHidden/>
     <w:unhideWhenUsed/>
+    <w:qFormat/>
     <w:uiPriority w:val="1"/>
   </w:style>
   <w:style w:type="table" w:default="1" w:styleId="38">
@@ -14424,6 +14502,7 @@
     <w:name w:val="List Number"/>
     <w:basedOn w:val="1"/>
     <w:unhideWhenUsed/>
+    <w:qFormat/>
     <w:uiPriority w:val="99"/>
     <w:pPr>
       <w:numPr>
@@ -14496,6 +14575,7 @@
     <w:name w:val="List"/>
     <w:basedOn w:val="1"/>
     <w:unhideWhenUsed/>
+    <w:qFormat/>
     <w:uiPriority w:val="99"/>
     <w:pPr>
       <w:ind w:left="360" w:hanging="360"/>

</xml_diff>